<commit_message>
Match every screen to the designer's mockup geometry
- Read exact positions, sizes and colours from the mockup SVGs and rebuilt the
  hero card, journey, parent (today/week/month), settings and routine sheet to them
- Body font is now Pretendard (subset), sizes derived from the mockup text outlines
- Characters render at the designer's box scale; hero cast placed from real ink bounds
- Sticker board follows the mockup grid (6 columns); docs updated

Co-Authored-By: Claude Fable 5.1 <noreply@anthropic.com>
</commit_message>
<xml_diff>
--- a/docs/docx/04-화면-명세서.docx
+++ b/docs/docx/04-화면-명세서.docx
@@ -1153,7 +1153,7 @@
               <w:rPr>
                 <w:sz w:val="18"/>
               </w:rPr>
-              <w:t>큰 제목은 빙그레체, 본문은 시스템 글꼴</w:t>
+              <w:t>큰 제목은 빙그레체, 그 밖은 Pretendard</w:t>
             </w:r>
           </w:p>
         </w:tc>
@@ -2029,7 +2029,7 @@
               <w:rPr>
                 <w:sz w:val="18"/>
               </w:rPr>
-              <w:t xml:space="preserve">노랑 그러데이션(높이 298, 모서리 30). 이름, </w:t>
+              <w:t xml:space="preserve">노랑 카드(높이 298, 모서리 30). 이름, </w:t>
             </w:r>
             <w:r>
               <w:rPr>
@@ -3745,16 +3745,9 @@
             <w:r/>
             <w:r>
               <w:rPr>
-                <w:rFonts w:ascii="Consolas" w:hAnsi="Consolas" w:eastAsia="Consolas"/>
                 <w:sz w:val="18"/>
               </w:rPr>
-              <w:t>PARENT REPORT</w:t>
-            </w:r>
-            <w:r>
-              <w:rPr>
-                <w:sz w:val="18"/>
-              </w:rPr>
-              <w:t>, “○○의 기록”</w:t>
+              <w:t>아바타 동그라미(42)와 “○○의 기록”</w:t>
             </w:r>
           </w:p>
         </w:tc>
@@ -3920,7 +3913,7 @@
               <w:rPr>
                 <w:sz w:val="18"/>
               </w:rPr>
-              <w:t>루틴(행) × 월~일(열). ● 앱 완료, ◐ 부모 표시, ○ 안 함, 빈칸 해당 없음. 칸을 눌러 표시·해제</w:t>
+              <w:t>루틴(행) × 월~일(열). 색이 찬 동그라미는 완료(부모 표시는 옅게), 빈 동그라미는 안 함. 주말 전용 루틴의 평일 칸만 비운다. 칸을 눌러 표시·해제</w:t>
             </w:r>
           </w:p>
         </w:tc>
@@ -4017,7 +4010,7 @@
               <w:rPr>
                 <w:sz w:val="18"/>
               </w:rPr>
-              <w:t>28칸. 완료할 때마다 그 루틴의 캐릭터가 붙는다</w:t>
+              <w:t>6칸씩 3줄에서 시작해 넘치면 한 줄씩 늘어난다. 완료할 때마다 그 루틴의 캐릭터가 붙는다</w:t>
             </w:r>
           </w:p>
         </w:tc>

</xml_diff>